<commit_message>
docs: align academic document with portfolio details
</commit_message>
<xml_diff>
--- a/TG/portfolio-academico.docx
+++ b/TG/portfolio-academico.docx
@@ -226,6 +226,33 @@
     </w:p>
     <w:p>
       <w:pPr>
+        <w:spacing w:line="360" w:lineRule="auto"/>
+        <w:ind w:firstLine="709"/>
+      </w:pPr>
+      <w:r>
+        <w:t>Contribuições pessoais: participei do entendimento do problema, organização das atividades, implementação das operações, testes e documentação.</w:t>
+      </w:r>
+    </w:p>
+    <w:p>
+      <w:pPr>
+        <w:spacing w:line="360" w:lineRule="auto"/>
+        <w:ind w:firstLine="709"/>
+      </w:pPr>
+      <w:r>
+        <w:t>Hard skills: lógica de programação, Portugol, estruturas condicionais, funções e GitHub.</w:t>
+      </w:r>
+    </w:p>
+    <w:p>
+      <w:pPr>
+        <w:spacing w:line="360" w:lineRule="auto"/>
+        <w:ind w:firstLine="709"/>
+      </w:pPr>
+      <w:r>
+        <w:t>Soft skills: trabalho em equipe, comunicação, organização, resolução de problemas e adaptação.</w:t>
+      </w:r>
+    </w:p>
+    <w:p>
+      <w:pPr>
         <w:pStyle w:val="Heading2"/>
       </w:pPr>
       <w:r>
@@ -239,6 +266,33 @@
       </w:pPr>
       <w:r>
         <w:t>O Concord Grid Manager organiza horários de aula sem sobreposição, considerando disciplinas, professores, cursos, turmas e a carga semanal. O sistema permite cadastros, montagem da grade, edição manual, validação de conflitos e organização do semestre. Participei do entendimento dos requisitos, backlog, implementação, testes, documentação e revisão das entregas. Tecnologias: JavaFX, Java, Maven, Scene Builder e MySQL. Repositório: https://github.com/Concord-API/API-2.</w:t>
+      </w:r>
+    </w:p>
+    <w:p>
+      <w:pPr>
+        <w:spacing w:line="360" w:lineRule="auto"/>
+        <w:ind w:firstLine="709"/>
+      </w:pPr>
+      <w:r>
+        <w:t>Contribuições pessoais: participei do entendimento dos requisitos, backlog, implementação, testes, documentação e revisão das entregas.</w:t>
+      </w:r>
+    </w:p>
+    <w:p>
+      <w:pPr>
+        <w:spacing w:line="360" w:lineRule="auto"/>
+        <w:ind w:firstLine="709"/>
+      </w:pPr>
+      <w:r>
+        <w:t>Hard skills: Java, JavaFX, MySQL, modelagem de dados, regras de negócio, Maven e Git.</w:t>
+      </w:r>
+    </w:p>
+    <w:p>
+      <w:pPr>
+        <w:spacing w:line="360" w:lineRule="auto"/>
+        <w:ind w:firstLine="709"/>
+      </w:pPr>
+      <w:r>
+        <w:t>Soft skills: trabalho colaborativo, comunicação, organização de sprint, análise de conflitos e documentação técnica.</w:t>
       </w:r>
     </w:p>
     <w:p>
@@ -260,6 +314,33 @@
     </w:p>
     <w:p>
       <w:pPr>
+        <w:spacing w:line="360" w:lineRule="auto"/>
+        <w:ind w:firstLine="709"/>
+      </w:pPr>
+      <w:r>
+        <w:t>Contribuições pessoais: participei do levantamento de requisitos, priorização do backlog, desenvolvimento, testes, documentação e revisão das entregas.</w:t>
+      </w:r>
+    </w:p>
+    <w:p>
+      <w:pPr>
+        <w:spacing w:line="360" w:lineRule="auto"/>
+        <w:ind w:firstLine="709"/>
+      </w:pPr>
+      <w:r>
+        <w:t>Hard skills: Java, Spring, TypeScript, JavaScript, HTML, CSS, MySQL, Docker e desenvolvimento de APIs.</w:t>
+      </w:r>
+    </w:p>
+    <w:p>
+      <w:pPr>
+        <w:spacing w:line="360" w:lineRule="auto"/>
+        <w:ind w:firstLine="709"/>
+      </w:pPr>
+      <w:r>
+        <w:t>Soft skills: comunicação, organização de backlog, trabalho em sprints, responsabilidade compartilhada e adaptação.</w:t>
+      </w:r>
+    </w:p>
+    <w:p>
+      <w:pPr>
         <w:pStyle w:val="Heading2"/>
       </w:pPr>
       <w:r>
@@ -273,6 +354,33 @@
       </w:pPr>
       <w:r>
         <w:t>O Trivio gerencia manutenções em equipamentos distribuídos globalmente. A solução contempla técnicos, equipamentos, requisitos, prioridades, localizações, manutenções recorrentes, documentação, alertas e mapa. Participei do entendimento do problema, backlog, implementação, testes, documentação e revisão das entregas. Tecnologias: Java, Spring, JavaScript, TypeScript, HTML, CSS, Vue.js, Oracle Database, Docker, Git e GitHub. Repositório: https://github.com/Concord-API/API-4.</w:t>
+      </w:r>
+    </w:p>
+    <w:p>
+      <w:pPr>
+        <w:spacing w:line="360" w:lineRule="auto"/>
+        <w:ind w:firstLine="709"/>
+      </w:pPr>
+      <w:r>
+        <w:t>Contribuições pessoais: participei do entendimento do problema, backlog, implementação, testes, documentação e revisão das entregas.</w:t>
+      </w:r>
+    </w:p>
+    <w:p>
+      <w:pPr>
+        <w:spacing w:line="360" w:lineRule="auto"/>
+        <w:ind w:firstLine="709"/>
+      </w:pPr>
+      <w:r>
+        <w:t>Hard skills: Java, Spring, Vue.js, JavaScript, TypeScript, Oracle Database, Docker e integração entre camadas.</w:t>
+      </w:r>
+    </w:p>
+    <w:p>
+      <w:pPr>
+        <w:spacing w:line="360" w:lineRule="auto"/>
+        <w:ind w:firstLine="709"/>
+      </w:pPr>
+      <w:r>
+        <w:t>Soft skills: trabalho em equipe, planejamento, comunicação técnica, organização de prioridades e resolução de problemas.</w:t>
       </w:r>
     </w:p>
     <w:p>

</xml_diff>